<commit_message>
Online Examination System: Documentation Modifications #1 - Phase 1
</commit_message>
<xml_diff>
--- a/public/Online Examination System.docx
+++ b/public/Online Examination System.docx
@@ -814,6 +814,20 @@
         </w:rPr>
         <w:t xml:space="preserve"> Repo: </w:t>
       </w:r>
+      <w:hyperlink r:id="rId7" w:history="1">
+        <w:r>
+          <w:rPr>
+            <w:rStyle w:val="Hyperlink"/>
+            <w:b/>
+            <w:bCs/>
+            <w:sz w:val="36"/>
+            <w:szCs w:val="36"/>
+          </w:rPr>
+          <w:t>online-examination-system</w:t>
+        </w:r>
+      </w:hyperlink>
+      <w:bookmarkStart w:id="0" w:name="_GoBack"/>
+      <w:bookmarkEnd w:id="0"/>
     </w:p>
     <w:p>
       <w:pPr>
@@ -1060,7 +1074,7 @@
                     <pic:cNvPicPr/>
                   </pic:nvPicPr>
                   <pic:blipFill>
-                    <a:blip r:embed="rId7">
+                    <a:blip r:embed="rId8">
                       <a:extLst>
                         <a:ext uri="{28A0092B-C50C-407E-A947-70E740481C1C}">
                           <a14:useLocalDpi xmlns:a14="http://schemas.microsoft.com/office/drawing/2010/main" val="0"/>
@@ -1142,8 +1156,6 @@
           <w:szCs w:val="36"/>
         </w:rPr>
       </w:pPr>
-      <w:bookmarkStart w:id="0" w:name="_GoBack"/>
-      <w:bookmarkEnd w:id="0"/>
       <w:r>
         <w:rPr>
           <w:b/>
@@ -1576,7 +1588,7 @@
       </w:r>
     </w:p>
     <w:sectPr>
-      <w:footerReference w:type="default" r:id="rId8"/>
+      <w:footerReference w:type="default" r:id="rId9"/>
       <w:pgSz w:w="12240" w:h="15840"/>
       <w:pgMar w:top="1440" w:right="1440" w:bottom="1440" w:left="1440" w:header="720" w:footer="720" w:gutter="0"/>
       <w:pgBorders w:offsetFrom="page">

</xml_diff>

<commit_message>
Online Examination System: Database Modifications #1 - Phase 2
</commit_message>
<xml_diff>
--- a/public/Online Examination System.docx
+++ b/public/Online Examination System.docx
@@ -826,8 +826,6 @@
           <w:t>online-examination-system</w:t>
         </w:r>
       </w:hyperlink>
-      <w:bookmarkStart w:id="0" w:name="_GoBack"/>
-      <w:bookmarkEnd w:id="0"/>
     </w:p>
     <w:p>
       <w:pPr>
@@ -1036,6 +1034,7 @@
         <w:rPr>
           <w:b/>
           <w:bCs/>
+          <w:noProof/>
           <w:sz w:val="36"/>
           <w:szCs w:val="36"/>
         </w:rPr>
@@ -1047,9 +1046,19 @@
           <w:sz w:val="36"/>
           <w:szCs w:val="36"/>
         </w:rPr>
-        <w:lastRenderedPageBreak/>
         <w:t>Entity Relationship Diagram (ERD)</w:t>
       </w:r>
+    </w:p>
+    <w:p>
+      <w:pPr>
+        <w:rPr>
+          <w:b/>
+          <w:bCs/>
+          <w:sz w:val="36"/>
+          <w:szCs w:val="36"/>
+        </w:rPr>
+      </w:pPr>
+      <w:bookmarkStart w:id="0" w:name="_GoBack"/>
       <w:r>
         <w:rPr>
           <w:b/>
@@ -1058,11 +1067,12 @@
           <w:sz w:val="36"/>
           <w:szCs w:val="36"/>
         </w:rPr>
+        <w:lastRenderedPageBreak/>
         <w:drawing>
           <wp:inline distT="0" distB="0" distL="0" distR="0">
-            <wp:extent cx="5585460" cy="6678683"/>
-            <wp:effectExtent l="114300" t="114300" r="148590" b="141605"/>
-            <wp:docPr id="2" name="Picture 2"/>
+            <wp:extent cx="5153660" cy="8229600"/>
+            <wp:effectExtent l="0" t="0" r="8890" b="0"/>
+            <wp:docPr id="1" name="Picture 1"/>
             <wp:cNvGraphicFramePr>
               <a:graphicFrameLocks xmlns:a="http://schemas.openxmlformats.org/drawingml/2006/main" noChangeAspect="1"/>
             </wp:cNvGraphicFramePr>
@@ -1070,11 +1080,11 @@
               <a:graphicData uri="http://schemas.openxmlformats.org/drawingml/2006/picture">
                 <pic:pic xmlns:pic="http://schemas.openxmlformats.org/drawingml/2006/picture">
                   <pic:nvPicPr>
-                    <pic:cNvPr id="2" name="online-examination-system-erd.png"/>
+                    <pic:cNvPr id="1" name="online-examination-system-erd.png"/>
                     <pic:cNvPicPr/>
                   </pic:nvPicPr>
                   <pic:blipFill>
-                    <a:blip r:embed="rId8">
+                    <a:blip r:embed="rId8" cstate="print">
                       <a:extLst>
                         <a:ext uri="{28A0092B-C50C-407E-A947-70E740481C1C}">
                           <a14:useLocalDpi xmlns:a14="http://schemas.microsoft.com/office/drawing/2010/main" val="0"/>
@@ -1088,41 +1098,11 @@
                   <pic:spPr>
                     <a:xfrm>
                       <a:off x="0" y="0"/>
-                      <a:ext cx="5592186" cy="6686725"/>
+                      <a:ext cx="5153660" cy="8229600"/>
                     </a:xfrm>
                     <a:prstGeom prst="rect">
                       <a:avLst/>
                     </a:prstGeom>
-                    <a:solidFill>
-                      <a:srgbClr val="FFFFFF">
-                        <a:shade val="85000"/>
-                      </a:srgbClr>
-                    </a:solidFill>
-                    <a:ln w="88900" cap="sq">
-                      <a:solidFill>
-                        <a:srgbClr val="FFFFFF"/>
-                      </a:solidFill>
-                      <a:miter lim="800000"/>
-                    </a:ln>
-                    <a:effectLst>
-                      <a:outerShdw blurRad="55000" dist="18000" dir="5400000" algn="tl" rotWithShape="0">
-                        <a:srgbClr val="000000">
-                          <a:alpha val="40000"/>
-                        </a:srgbClr>
-                      </a:outerShdw>
-                    </a:effectLst>
-                    <a:scene3d>
-                      <a:camera prst="orthographicFront"/>
-                      <a:lightRig rig="twoPt" dir="t">
-                        <a:rot lat="0" lon="0" rev="7200000"/>
-                      </a:lightRig>
-                    </a:scene3d>
-                    <a:sp3d>
-                      <a:bevelT w="25400" h="19050"/>
-                      <a:contourClr>
-                        <a:srgbClr val="FFFFFF"/>
-                      </a:contourClr>
-                    </a:sp3d>
                   </pic:spPr>
                 </pic:pic>
               </a:graphicData>
@@ -1130,6 +1110,7 @@
           </wp:inline>
         </w:drawing>
       </w:r>
+      <w:bookmarkEnd w:id="0"/>
     </w:p>
     <w:p>
       <w:pPr>
@@ -1163,7 +1144,6 @@
           <w:sz w:val="36"/>
           <w:szCs w:val="36"/>
         </w:rPr>
-        <w:lastRenderedPageBreak/>
         <w:t>System Overview:</w:t>
       </w:r>
     </w:p>
@@ -1544,6 +1524,7 @@
           <w:sz w:val="32"/>
           <w:szCs w:val="32"/>
         </w:rPr>
+        <w:lastRenderedPageBreak/>
         <w:t xml:space="preserve">This project is developed for </w:t>
       </w:r>
       <w:r>
@@ -1674,7 +1655,7 @@
         <w:noProof/>
         <w:color w:val="5B9BD5" w:themeColor="accent1"/>
       </w:rPr>
-      <w:t>4</w:t>
+      <w:t>5</w:t>
     </w:r>
     <w:r>
       <w:rPr>

</xml_diff>